<commit_message>
Reporte accesibilidad versión final
</commit_message>
<xml_diff>
--- a/Docs/Reporte de Accesibilidad.docx
+++ b/Docs/Reporte de Accesibilidad.docx
@@ -1942,7 +1942,6 @@
         </w:rPr>
         <w:t xml:space="preserve">Pez </w:t>
       </w:r>
-      <w:proofErr w:type="spellStart"/>
       <w:r>
         <w:rPr>
           <w:rFonts w:ascii="Arial" w:hAnsi="Arial" w:cs="Arial"/>
@@ -1953,7 +1952,6 @@
         </w:rPr>
         <w:t>cafe</w:t>
       </w:r>
-      <w:proofErr w:type="spellEnd"/>
       <w:r>
         <w:rPr>
           <w:rFonts w:ascii="Arial" w:hAnsi="Arial" w:cs="Arial"/>
@@ -2371,85 +2369,7 @@
           <w:szCs w:val="22"/>
           <w:lang w:eastAsia="es-CO"/>
         </w:rPr>
-        <w:t>3.2. Selección mediante clic (</w:t>
-      </w:r>
-      <w:proofErr w:type="gramStart"/>
-      <w:r>
-        <w:rPr>
-          <w:rFonts w:ascii="Arial" w:hAnsi="Arial" w:cs="Arial"/>
-          <w:b/>
-          <w:bCs/>
-          <w:kern w:val="0"/>
-          <w:sz w:val="22"/>
-          <w:szCs w:val="22"/>
-          <w:lang w:eastAsia="es-CO"/>
-        </w:rPr>
-        <w:t>Click</w:t>
-      </w:r>
-      <w:proofErr w:type="gramEnd"/>
-      <w:r>
-        <w:rPr>
-          <w:rFonts w:ascii="Arial" w:hAnsi="Arial" w:cs="Arial"/>
-          <w:b/>
-          <w:bCs/>
-          <w:kern w:val="0"/>
-          <w:sz w:val="22"/>
-          <w:szCs w:val="22"/>
-          <w:lang w:eastAsia="es-CO"/>
-        </w:rPr>
-        <w:t>-</w:t>
-      </w:r>
-      <w:proofErr w:type="spellStart"/>
-      <w:r>
-        <w:rPr>
-          <w:rFonts w:ascii="Arial" w:hAnsi="Arial" w:cs="Arial"/>
-          <w:b/>
-          <w:bCs/>
-          <w:kern w:val="0"/>
-          <w:sz w:val="22"/>
-          <w:szCs w:val="22"/>
-          <w:lang w:eastAsia="es-CO"/>
-        </w:rPr>
-        <w:t>to</w:t>
-      </w:r>
-      <w:proofErr w:type="spellEnd"/>
-      <w:r>
-        <w:rPr>
-          <w:rFonts w:ascii="Arial" w:hAnsi="Arial" w:cs="Arial"/>
-          <w:b/>
-          <w:bCs/>
-          <w:kern w:val="0"/>
-          <w:sz w:val="22"/>
-          <w:szCs w:val="22"/>
-          <w:lang w:eastAsia="es-CO"/>
-        </w:rPr>
-        <w:t>-</w:t>
-      </w:r>
-      <w:proofErr w:type="gramStart"/>
-      <w:r>
-        <w:rPr>
-          <w:rFonts w:ascii="Arial" w:hAnsi="Arial" w:cs="Arial"/>
-          <w:b/>
-          <w:bCs/>
-          <w:kern w:val="0"/>
-          <w:sz w:val="22"/>
-          <w:szCs w:val="22"/>
-          <w:lang w:eastAsia="es-CO"/>
-        </w:rPr>
-        <w:t>Click</w:t>
-      </w:r>
-      <w:proofErr w:type="gramEnd"/>
-      <w:r>
-        <w:rPr>
-          <w:rFonts w:ascii="Arial" w:hAnsi="Arial" w:cs="Arial"/>
-          <w:b/>
-          <w:bCs/>
-          <w:kern w:val="0"/>
-          <w:sz w:val="22"/>
-          <w:szCs w:val="22"/>
-          <w:lang w:eastAsia="es-CO"/>
-        </w:rPr>
-        <w:t>)</w:t>
+        <w:t>3.2. Selección mediante clic (Click-to-Click)</w:t>
       </w:r>
     </w:p>
     <w:p>
@@ -4063,9 +3983,9 @@
         <w:tblLook w:val="04A0" w:firstRow="1" w:lastRow="0" w:firstColumn="1" w:lastColumn="0" w:noHBand="0" w:noVBand="1"/>
       </w:tblPr>
       <w:tblGrid>
-        <w:gridCol w:w="2514"/>
-        <w:gridCol w:w="3863"/>
-        <w:gridCol w:w="2461"/>
+        <w:gridCol w:w="2761"/>
+        <w:gridCol w:w="4392"/>
+        <w:gridCol w:w="1685"/>
       </w:tblGrid>
       <w:tr>
         <w:trPr>
@@ -4242,7 +4162,7 @@
                 <w:szCs w:val="22"/>
                 <w:lang w:eastAsia="es-CO"/>
               </w:rPr>
-              <w:t>Capturas de las cuatro canecas.</w:t>
+              <w:t>Grabación de videojuego.</w:t>
             </w:r>
           </w:p>
         </w:tc>
@@ -4310,7 +4230,6 @@
         <w:tc>
           <w:tcPr>
             <w:tcW w:w="0" w:type="auto"/>
-            <w:vAlign w:val="center"/>
             <w:hideMark/>
           </w:tcPr>
           <w:p>
@@ -4331,7 +4250,7 @@
                 <w:szCs w:val="22"/>
                 <w:lang w:eastAsia="es-CO"/>
               </w:rPr>
-              <w:t>Capturas y mediciones de contraste.</w:t>
+              <w:t>Grabación de videojuego.</w:t>
             </w:r>
           </w:p>
         </w:tc>
@@ -4399,7 +4318,6 @@
         <w:tc>
           <w:tcPr>
             <w:tcW w:w="0" w:type="auto"/>
-            <w:vAlign w:val="center"/>
             <w:hideMark/>
           </w:tcPr>
           <w:p>
@@ -4420,7 +4338,7 @@
                 <w:szCs w:val="22"/>
                 <w:lang w:eastAsia="es-CO"/>
               </w:rPr>
-              <w:t>Pruebas de las teclas 1, 2, 3, 4 y R.</w:t>
+              <w:t>Grabación de videojuego.</w:t>
             </w:r>
           </w:p>
         </w:tc>
@@ -4481,80 +4399,13 @@
                 <w:szCs w:val="22"/>
                 <w:lang w:eastAsia="es-CO"/>
               </w:rPr>
-              <w:t xml:space="preserve">Evaluación de la alternativa </w:t>
-            </w:r>
-            <w:proofErr w:type="gramStart"/>
-            <w:r>
-              <w:rPr>
-                <w:rFonts w:ascii="Arial" w:hAnsi="Arial" w:cs="Arial"/>
-                <w:kern w:val="0"/>
-                <w:sz w:val="22"/>
-                <w:szCs w:val="22"/>
-                <w:lang w:eastAsia="es-CO"/>
-              </w:rPr>
-              <w:t>Click</w:t>
-            </w:r>
-            <w:proofErr w:type="gramEnd"/>
-            <w:r>
-              <w:rPr>
-                <w:rFonts w:ascii="Arial" w:hAnsi="Arial" w:cs="Arial"/>
-                <w:kern w:val="0"/>
-                <w:sz w:val="22"/>
-                <w:szCs w:val="22"/>
-                <w:lang w:eastAsia="es-CO"/>
-              </w:rPr>
-              <w:t>-</w:t>
-            </w:r>
-            <w:proofErr w:type="spellStart"/>
-            <w:r>
-              <w:rPr>
-                <w:rFonts w:ascii="Arial" w:hAnsi="Arial" w:cs="Arial"/>
-                <w:kern w:val="0"/>
-                <w:sz w:val="22"/>
-                <w:szCs w:val="22"/>
-                <w:lang w:eastAsia="es-CO"/>
-              </w:rPr>
-              <w:t>to</w:t>
-            </w:r>
-            <w:proofErr w:type="spellEnd"/>
-            <w:r>
-              <w:rPr>
-                <w:rFonts w:ascii="Arial" w:hAnsi="Arial" w:cs="Arial"/>
-                <w:kern w:val="0"/>
-                <w:sz w:val="22"/>
-                <w:szCs w:val="22"/>
-                <w:lang w:eastAsia="es-CO"/>
-              </w:rPr>
-              <w:t>-</w:t>
-            </w:r>
-            <w:proofErr w:type="gramStart"/>
-            <w:r>
-              <w:rPr>
-                <w:rFonts w:ascii="Arial" w:hAnsi="Arial" w:cs="Arial"/>
-                <w:kern w:val="0"/>
-                <w:sz w:val="22"/>
-                <w:szCs w:val="22"/>
-                <w:lang w:eastAsia="es-CO"/>
-              </w:rPr>
-              <w:t>Click</w:t>
-            </w:r>
-            <w:proofErr w:type="gramEnd"/>
-            <w:r>
-              <w:rPr>
-                <w:rFonts w:ascii="Arial" w:hAnsi="Arial" w:cs="Arial"/>
-                <w:kern w:val="0"/>
-                <w:sz w:val="22"/>
-                <w:szCs w:val="22"/>
-                <w:lang w:eastAsia="es-CO"/>
-              </w:rPr>
-              <w:t xml:space="preserve"> para las acciones que requieren arrastrar.</w:t>
+              <w:t>Evaluación de la alternativa Click-to-Click para las acciones que requieren arrastrar.</w:t>
             </w:r>
           </w:p>
         </w:tc>
         <w:tc>
           <w:tcPr>
             <w:tcW w:w="0" w:type="auto"/>
-            <w:vAlign w:val="center"/>
             <w:hideMark/>
           </w:tcPr>
           <w:p>
@@ -4575,7 +4426,7 @@
                 <w:szCs w:val="22"/>
                 <w:lang w:eastAsia="es-CO"/>
               </w:rPr>
-              <w:t>Grabaciones de ambas modalidades.</w:t>
+              <w:t>Grabación de videojuego.</w:t>
             </w:r>
           </w:p>
         </w:tc>
@@ -4643,7 +4494,6 @@
         <w:tc>
           <w:tcPr>
             <w:tcW w:w="0" w:type="auto"/>
-            <w:vAlign w:val="center"/>
             <w:hideMark/>
           </w:tcPr>
           <w:p>
@@ -4664,7 +4514,7 @@
                 <w:szCs w:val="22"/>
                 <w:lang w:eastAsia="es-CO"/>
               </w:rPr>
-              <w:t>Registro de los contenidos audiovisuales aplicables.</w:t>
+              <w:t>Grabación de videojuego.</w:t>
             </w:r>
           </w:p>
         </w:tc>
@@ -4732,7 +4582,6 @@
         <w:tc>
           <w:tcPr>
             <w:tcW w:w="0" w:type="auto"/>
-            <w:vAlign w:val="center"/>
             <w:hideMark/>
           </w:tcPr>
           <w:p>
@@ -4753,7 +4602,7 @@
                 <w:szCs w:val="22"/>
                 <w:lang w:eastAsia="es-CO"/>
               </w:rPr>
-              <w:t>Pruebas de audio y controles disponibles.</w:t>
+              <w:t>Grabación de videojuego.</w:t>
             </w:r>
           </w:p>
         </w:tc>
@@ -4821,7 +4670,6 @@
         <w:tc>
           <w:tcPr>
             <w:tcW w:w="0" w:type="auto"/>
-            <w:vAlign w:val="center"/>
             <w:hideMark/>
           </w:tcPr>
           <w:p>
@@ -4842,7 +4690,7 @@
                 <w:szCs w:val="22"/>
                 <w:lang w:eastAsia="es-CO"/>
               </w:rPr>
-              <w:t>Capturas de los recursos gráficos.</w:t>
+              <w:t>Grabación de videojuego.</w:t>
             </w:r>
           </w:p>
         </w:tc>
@@ -4910,7 +4758,6 @@
         <w:tc>
           <w:tcPr>
             <w:tcW w:w="0" w:type="auto"/>
-            <w:vAlign w:val="center"/>
             <w:hideMark/>
           </w:tcPr>
           <w:p>
@@ -4931,7 +4778,7 @@
                 <w:szCs w:val="22"/>
                 <w:lang w:eastAsia="es-CO"/>
               </w:rPr>
-              <w:t>Grabaciones de las modalidades de interacción.</w:t>
+              <w:t>Grabación de videojuego.</w:t>
             </w:r>
           </w:p>
         </w:tc>
@@ -4999,7 +4846,6 @@
         <w:tc>
           <w:tcPr>
             <w:tcW w:w="0" w:type="auto"/>
-            <w:vAlign w:val="center"/>
             <w:hideMark/>
           </w:tcPr>
           <w:p>
@@ -5020,7 +4866,7 @@
                 <w:szCs w:val="22"/>
                 <w:lang w:eastAsia="es-CO"/>
               </w:rPr>
-              <w:t>Capturas de los estados del río y del HUD.</w:t>
+              <w:t>Grabación de videojuego.</w:t>
             </w:r>
           </w:p>
         </w:tc>
@@ -5053,142 +4899,551 @@
           <w:rFonts w:ascii="Arial" w:hAnsi="Arial" w:cs="Arial"/>
           <w:b/>
           <w:bCs/>
-          <w:kern w:val="0"/>
-          <w:sz w:val="22"/>
-          <w:szCs w:val="22"/>
-          <w:lang w:eastAsia="es-CO"/>
-        </w:rPr>
-      </w:pPr>
-      <w:r>
+          <w:sz w:val="22"/>
+          <w:szCs w:val="22"/>
+        </w:rPr>
+      </w:pPr>
+    </w:p>
+    <w:p>
+      <w:pPr>
         <w:rPr>
           <w:rFonts w:ascii="Arial" w:hAnsi="Arial" w:cs="Arial"/>
           <w:b/>
           <w:bCs/>
-          <w:kern w:val="0"/>
-          <w:sz w:val="22"/>
-          <w:szCs w:val="22"/>
-          <w:lang w:eastAsia="es-CO"/>
-        </w:rPr>
-        <w:t>6</w:t>
-      </w:r>
+          <w:sz w:val="22"/>
+          <w:szCs w:val="22"/>
+        </w:rPr>
+      </w:pPr>
       <w:r>
         <w:rPr>
           <w:rFonts w:ascii="Arial" w:hAnsi="Arial" w:cs="Arial"/>
           <w:b/>
           <w:bCs/>
-          <w:kern w:val="0"/>
-          <w:sz w:val="22"/>
-          <w:szCs w:val="22"/>
-          <w:lang w:eastAsia="es-CO"/>
-        </w:rPr>
-        <w:t>. Conclusiones</w:t>
-      </w:r>
-    </w:p>
-    <w:p>
-      <w:pPr>
-        <w:rPr>
-          <w:rFonts w:ascii="Arial" w:hAnsi="Arial" w:cs="Arial"/>
-          <w:kern w:val="0"/>
-          <w:sz w:val="22"/>
-          <w:szCs w:val="22"/>
-          <w:lang w:eastAsia="es-CO"/>
-        </w:rPr>
-      </w:pPr>
-      <w:r>
-        <w:rPr>
-          <w:rFonts w:ascii="Arial" w:hAnsi="Arial" w:cs="Arial"/>
-          <w:kern w:val="0"/>
-          <w:sz w:val="22"/>
-          <w:szCs w:val="22"/>
-          <w:lang w:eastAsia="es-CO"/>
-        </w:rPr>
-        <w:t xml:space="preserve">El diseño de </w:t>
+          <w:sz w:val="22"/>
+          <w:szCs w:val="22"/>
+        </w:rPr>
+        <w:t xml:space="preserve">6. </w:t>
+      </w:r>
+      <w:r>
+        <w:rPr>
+          <w:rFonts w:ascii="Arial" w:hAnsi="Arial" w:cs="Arial"/>
+          <w:b/>
+          <w:bCs/>
+          <w:sz w:val="22"/>
+          <w:szCs w:val="22"/>
+        </w:rPr>
+        <w:t>Aplicación de WebAIM y redundancia de señales accesibles</w:t>
+      </w:r>
+    </w:p>
+    <w:p>
+      <w:pPr>
+        <w:rPr>
+          <w:rFonts w:ascii="Arial" w:hAnsi="Arial" w:cs="Arial"/>
+          <w:b/>
+          <w:bCs/>
+          <w:sz w:val="22"/>
+          <w:szCs w:val="22"/>
+        </w:rPr>
+      </w:pPr>
+      <w:r>
+        <w:rPr>
+          <w:rFonts w:ascii="Arial" w:hAnsi="Arial" w:cs="Arial"/>
+          <w:b/>
+          <w:bCs/>
+          <w:sz w:val="22"/>
+          <w:szCs w:val="22"/>
+        </w:rPr>
+        <w:t>6.1</w:t>
+      </w:r>
+      <w:r>
+        <w:rPr>
+          <w:rFonts w:ascii="Arial" w:hAnsi="Arial" w:cs="Arial"/>
+          <w:b/>
+          <w:bCs/>
+          <w:sz w:val="22"/>
+          <w:szCs w:val="22"/>
+        </w:rPr>
+        <w:t>. Referencia a WebAIM</w:t>
+      </w:r>
+    </w:p>
+    <w:p>
+      <w:pPr>
+        <w:rPr>
+          <w:rFonts w:ascii="Arial" w:hAnsi="Arial" w:cs="Arial"/>
+          <w:sz w:val="22"/>
+          <w:szCs w:val="22"/>
+        </w:rPr>
+      </w:pPr>
+      <w:r>
+        <w:rPr>
+          <w:rFonts w:ascii="Arial" w:hAnsi="Arial" w:cs="Arial"/>
+          <w:sz w:val="22"/>
+          <w:szCs w:val="22"/>
+        </w:rPr>
+        <w:t xml:space="preserve">Para orientar las decisiones de accesibilidad visual de </w:t>
       </w:r>
       <w:r>
         <w:rPr>
           <w:rFonts w:ascii="Arial" w:hAnsi="Arial" w:cs="Arial"/>
           <w:i/>
           <w:iCs/>
-          <w:kern w:val="0"/>
-          <w:sz w:val="22"/>
-          <w:szCs w:val="22"/>
-          <w:lang w:eastAsia="es-CO"/>
+          <w:sz w:val="22"/>
+          <w:szCs w:val="22"/>
         </w:rPr>
         <w:t>Río Limpio Adventure</w:t>
       </w:r>
       <w:r>
         <w:rPr>
           <w:rFonts w:ascii="Arial" w:hAnsi="Arial" w:cs="Arial"/>
-          <w:kern w:val="0"/>
-          <w:sz w:val="22"/>
-          <w:szCs w:val="22"/>
-          <w:lang w:eastAsia="es-CO"/>
-        </w:rPr>
-        <w:t xml:space="preserve"> contempla recursos que pueden favorecer la accesibilidad visual y motora. Destacan la identificación de las canecas mediante colores, patrones, símbolos y números; la representación visual del progreso ambiental; la retroalimentación mediante el resplandor dorado y los mensajes de confirmación; y las distintas modalidades de interacción previstas.</w:t>
-      </w:r>
-    </w:p>
-    <w:p>
-      <w:pPr>
-        <w:rPr>
-          <w:rFonts w:ascii="Arial" w:hAnsi="Arial" w:cs="Arial"/>
-          <w:kern w:val="0"/>
-          <w:sz w:val="22"/>
-          <w:szCs w:val="22"/>
-          <w:lang w:eastAsia="es-CO"/>
-        </w:rPr>
-      </w:pPr>
-      <w:r>
-        <w:rPr>
-          <w:rFonts w:ascii="Arial" w:hAnsi="Arial" w:cs="Arial"/>
-          <w:kern w:val="0"/>
-          <w:sz w:val="22"/>
-          <w:szCs w:val="22"/>
-          <w:lang w:eastAsia="es-CO"/>
+          <w:sz w:val="22"/>
+          <w:szCs w:val="22"/>
+        </w:rPr>
+        <w:t>, se toma como referencia a WebAIM (Web Accessibility In Mind), organización que ofrece recursos y recomendaciones para mejorar la accesibilidad del contenido digital.</w:t>
+      </w:r>
+    </w:p>
+    <w:p>
+      <w:pPr>
+        <w:rPr>
+          <w:rFonts w:ascii="Arial" w:hAnsi="Arial" w:cs="Arial"/>
+          <w:sz w:val="22"/>
+          <w:szCs w:val="22"/>
+        </w:rPr>
+      </w:pPr>
+      <w:r>
+        <w:rPr>
+          <w:rFonts w:ascii="Arial" w:hAnsi="Arial" w:cs="Arial"/>
+          <w:sz w:val="22"/>
+          <w:szCs w:val="22"/>
         </w:rPr>
         <w:lastRenderedPageBreak/>
-        <w:t>Estas características se relacionan con los principios del Diseño Universal para el Aprendizaje, ya que ofrecen distintas formas de presentar información y alternativas para interactuar con la actividad.</w:t>
-      </w:r>
-    </w:p>
-    <w:p>
-      <w:pPr>
-        <w:rPr>
-          <w:rFonts w:ascii="Arial" w:hAnsi="Arial" w:cs="Arial"/>
-          <w:kern w:val="0"/>
-          <w:sz w:val="22"/>
-          <w:szCs w:val="22"/>
-          <w:lang w:eastAsia="es-CO"/>
-        </w:rPr>
-      </w:pPr>
-      <w:r>
-        <w:rPr>
-          <w:rFonts w:ascii="Arial" w:hAnsi="Arial" w:cs="Arial"/>
-          <w:kern w:val="0"/>
-          <w:sz w:val="22"/>
-          <w:szCs w:val="22"/>
-          <w:lang w:eastAsia="es-CO"/>
-        </w:rPr>
-        <w:t>Sin embargo, su presencia no demuestra por sí sola el cumplimiento integral de WCAG 2.2. Es necesario verificar el contraste, la legibilidad, el funcionamiento de los controles de teclado, la equivalencia funcional de las alternativas al arrastre y la existencia de señales visuales para la información sonora relevante.</w:t>
-      </w:r>
-    </w:p>
-    <w:p>
-      <w:pPr>
-        <w:rPr>
-          <w:rFonts w:ascii="Arial" w:hAnsi="Arial" w:cs="Arial"/>
-          <w:kern w:val="0"/>
-          <w:sz w:val="22"/>
-          <w:szCs w:val="22"/>
-          <w:lang w:eastAsia="es-CO"/>
-        </w:rPr>
-      </w:pPr>
-      <w:r>
-        <w:rPr>
-          <w:rFonts w:ascii="Arial" w:hAnsi="Arial" w:cs="Arial"/>
-          <w:kern w:val="0"/>
-          <w:sz w:val="22"/>
-          <w:szCs w:val="22"/>
-          <w:lang w:eastAsia="es-CO"/>
-        </w:rPr>
-        <w:t>Por tanto, el proyecto presenta medidas de diseño orientadas a la accesibilidad, cuya eficacia debe confirmarse mediante pruebas funcionales y evidencias documentadas.</w:t>
+        <w:t xml:space="preserve">Se considera especialmente el principio de no utilizar el color como único medio para transmitir información. Esta recomendación también se relaciona con el criterio 1.4.1 de las Pautas de Accesibilidad para el Contenido Web (WCAG), denominado </w:t>
+      </w:r>
+      <w:r>
+        <w:rPr>
+          <w:rFonts w:ascii="Arial" w:hAnsi="Arial" w:cs="Arial"/>
+          <w:i/>
+          <w:iCs/>
+          <w:sz w:val="22"/>
+          <w:szCs w:val="22"/>
+        </w:rPr>
+        <w:t>Use of Color</w:t>
+      </w:r>
+      <w:r>
+        <w:rPr>
+          <w:rFonts w:ascii="Arial" w:hAnsi="Arial" w:cs="Arial"/>
+          <w:sz w:val="22"/>
+          <w:szCs w:val="22"/>
+        </w:rPr>
+        <w:t>.</w:t>
+      </w:r>
+    </w:p>
+    <w:p>
+      <w:pPr>
+        <w:rPr>
+          <w:rFonts w:ascii="Arial" w:hAnsi="Arial" w:cs="Arial"/>
+          <w:sz w:val="22"/>
+          <w:szCs w:val="22"/>
+        </w:rPr>
+      </w:pPr>
+      <w:r>
+        <w:rPr>
+          <w:rFonts w:ascii="Arial" w:hAnsi="Arial" w:cs="Arial"/>
+          <w:sz w:val="22"/>
+          <w:szCs w:val="22"/>
+        </w:rPr>
+        <w:t xml:space="preserve">Referencia: </w:t>
+      </w:r>
+      <w:hyperlink r:id="rId5" w:history="1">
+        <w:r>
+          <w:rPr>
+            <w:rStyle w:val="Hipervnculo"/>
+            <w:rFonts w:ascii="Arial" w:hAnsi="Arial" w:cs="Arial"/>
+            <w:sz w:val="22"/>
+            <w:szCs w:val="22"/>
+          </w:rPr>
+          <w:t>WebAIM</w:t>
+        </w:r>
+      </w:hyperlink>
+      <w:r>
+        <w:rPr>
+          <w:rFonts w:ascii="Arial" w:hAnsi="Arial" w:cs="Arial"/>
+          <w:sz w:val="22"/>
+          <w:szCs w:val="22"/>
+        </w:rPr>
+        <w:t xml:space="preserve"> y </w:t>
+      </w:r>
+      <w:hyperlink r:id="rId6" w:history="1">
+        <w:r>
+          <w:rPr>
+            <w:rStyle w:val="Hipervnculo"/>
+            <w:rFonts w:ascii="Arial" w:hAnsi="Arial" w:cs="Arial"/>
+            <w:sz w:val="22"/>
+            <w:szCs w:val="22"/>
+          </w:rPr>
+          <w:t>WCAG 2.2, criterio 1.4.1</w:t>
+        </w:r>
+      </w:hyperlink>
+      <w:r>
+        <w:rPr>
+          <w:rFonts w:ascii="Arial" w:hAnsi="Arial" w:cs="Arial"/>
+          <w:sz w:val="22"/>
+          <w:szCs w:val="22"/>
+        </w:rPr>
+        <w:t>.</w:t>
+      </w:r>
+    </w:p>
+    <w:p>
+      <w:pPr>
+        <w:rPr>
+          <w:rFonts w:ascii="Arial" w:hAnsi="Arial" w:cs="Arial"/>
+          <w:b/>
+          <w:bCs/>
+          <w:sz w:val="22"/>
+          <w:szCs w:val="22"/>
+        </w:rPr>
+      </w:pPr>
+      <w:r>
+        <w:rPr>
+          <w:rFonts w:ascii="Arial" w:hAnsi="Arial" w:cs="Arial"/>
+          <w:b/>
+          <w:bCs/>
+          <w:sz w:val="22"/>
+          <w:szCs w:val="22"/>
+        </w:rPr>
+        <w:t>6.</w:t>
+      </w:r>
+      <w:r>
+        <w:rPr>
+          <w:rFonts w:ascii="Arial" w:hAnsi="Arial" w:cs="Arial"/>
+          <w:b/>
+          <w:bCs/>
+          <w:sz w:val="22"/>
+          <w:szCs w:val="22"/>
+        </w:rPr>
+        <w:t>2. Iconografía para personas con daltonismo</w:t>
+      </w:r>
+    </w:p>
+    <w:p>
+      <w:pPr>
+        <w:rPr>
+          <w:rFonts w:ascii="Arial" w:hAnsi="Arial" w:cs="Arial"/>
+          <w:sz w:val="22"/>
+          <w:szCs w:val="22"/>
+        </w:rPr>
+      </w:pPr>
+      <w:r>
+        <w:rPr>
+          <w:rFonts w:ascii="Arial" w:hAnsi="Arial" w:cs="Arial"/>
+          <w:sz w:val="22"/>
+          <w:szCs w:val="22"/>
+        </w:rPr>
+        <w:t>En el videojuego se diseñaron cuatro canecas identificadas mediante colores, iconos, patrones y números. Esta combinación permite distinguir las categorías de residuos sin depender exclusivamente de la percepción del color.</w:t>
+      </w:r>
+    </w:p>
+    <w:p>
+      <w:pPr>
+        <w:numPr>
+          <w:ilvl w:val="0"/>
+          <w:numId w:val="12"/>
+        </w:numPr>
+        <w:rPr>
+          <w:rFonts w:ascii="Arial" w:hAnsi="Arial" w:cs="Arial"/>
+          <w:sz w:val="22"/>
+          <w:szCs w:val="22"/>
+        </w:rPr>
+      </w:pPr>
+      <w:r>
+        <w:rPr>
+          <w:rFonts w:ascii="Arial" w:hAnsi="Arial" w:cs="Arial"/>
+          <w:b/>
+          <w:bCs/>
+          <w:sz w:val="22"/>
+          <w:szCs w:val="22"/>
+        </w:rPr>
+        <w:t>Caneca azul, número 1:</w:t>
+      </w:r>
+      <w:r>
+        <w:rPr>
+          <w:rFonts w:ascii="Arial" w:hAnsi="Arial" w:cs="Arial"/>
+          <w:sz w:val="22"/>
+          <w:szCs w:val="22"/>
+        </w:rPr>
+        <w:t xml:space="preserve"> presenta un icono de botella y una banda con líneas diagonales para identificar los residuos aprovechables.</w:t>
+      </w:r>
+    </w:p>
+    <w:p>
+      <w:pPr>
+        <w:numPr>
+          <w:ilvl w:val="0"/>
+          <w:numId w:val="12"/>
+        </w:numPr>
+        <w:rPr>
+          <w:rFonts w:ascii="Arial" w:hAnsi="Arial" w:cs="Arial"/>
+          <w:sz w:val="22"/>
+          <w:szCs w:val="22"/>
+        </w:rPr>
+      </w:pPr>
+      <w:r>
+        <w:rPr>
+          <w:rFonts w:ascii="Arial" w:hAnsi="Arial" w:cs="Arial"/>
+          <w:b/>
+          <w:bCs/>
+          <w:sz w:val="22"/>
+          <w:szCs w:val="22"/>
+        </w:rPr>
+        <w:t>Caneca roja, número 2:</w:t>
+      </w:r>
+      <w:r>
+        <w:rPr>
+          <w:rFonts w:ascii="Arial" w:hAnsi="Arial" w:cs="Arial"/>
+          <w:sz w:val="22"/>
+          <w:szCs w:val="22"/>
+        </w:rPr>
+        <w:t xml:space="preserve"> incorpora un triángulo de advertencia y un patrón de rombos para identificar los residuos especiales.</w:t>
+      </w:r>
+    </w:p>
+    <w:p>
+      <w:pPr>
+        <w:numPr>
+          <w:ilvl w:val="0"/>
+          <w:numId w:val="12"/>
+        </w:numPr>
+        <w:rPr>
+          <w:rFonts w:ascii="Arial" w:hAnsi="Arial" w:cs="Arial"/>
+          <w:sz w:val="22"/>
+          <w:szCs w:val="22"/>
+        </w:rPr>
+      </w:pPr>
+      <w:r>
+        <w:rPr>
+          <w:rFonts w:ascii="Arial" w:hAnsi="Arial" w:cs="Arial"/>
+          <w:b/>
+          <w:bCs/>
+          <w:sz w:val="22"/>
+          <w:szCs w:val="22"/>
+        </w:rPr>
+        <w:t>Caneca verde, número 3:</w:t>
+      </w:r>
+      <w:r>
+        <w:rPr>
+          <w:rFonts w:ascii="Arial" w:hAnsi="Arial" w:cs="Arial"/>
+          <w:sz w:val="22"/>
+          <w:szCs w:val="22"/>
+        </w:rPr>
+        <w:t xml:space="preserve"> utiliza un icono de hoja y un patrón de puntos para identificar los residuos orgánicos.</w:t>
+      </w:r>
+    </w:p>
+    <w:p>
+      <w:pPr>
+        <w:numPr>
+          <w:ilvl w:val="0"/>
+          <w:numId w:val="12"/>
+        </w:numPr>
+        <w:rPr>
+          <w:rFonts w:ascii="Arial" w:hAnsi="Arial" w:cs="Arial"/>
+          <w:sz w:val="22"/>
+          <w:szCs w:val="22"/>
+        </w:rPr>
+      </w:pPr>
+      <w:r>
+        <w:rPr>
+          <w:rFonts w:ascii="Arial" w:hAnsi="Arial" w:cs="Arial"/>
+          <w:b/>
+          <w:bCs/>
+          <w:sz w:val="22"/>
+          <w:szCs w:val="22"/>
+        </w:rPr>
+        <w:t>Caneca gris, número 4:</w:t>
+      </w:r>
+      <w:r>
+        <w:rPr>
+          <w:rFonts w:ascii="Arial" w:hAnsi="Arial" w:cs="Arial"/>
+          <w:sz w:val="22"/>
+          <w:szCs w:val="22"/>
+        </w:rPr>
+        <w:t xml:space="preserve"> presenta una X y un patrón de líneas horizontales para identificar los residuos no aprovechables.</w:t>
+      </w:r>
+    </w:p>
+    <w:p>
+      <w:pPr>
+        <w:rPr>
+          <w:rFonts w:ascii="Arial" w:hAnsi="Arial" w:cs="Arial"/>
+          <w:sz w:val="22"/>
+          <w:szCs w:val="22"/>
+        </w:rPr>
+      </w:pPr>
+      <w:r>
+        <w:rPr>
+          <w:rFonts w:ascii="Arial" w:hAnsi="Arial" w:cs="Arial"/>
+          <w:sz w:val="22"/>
+          <w:szCs w:val="22"/>
+        </w:rPr>
+        <w:t>La redundancia entre color, iconografía, patrón y numeración ofrece diferentes pistas visuales para reconocer cada categoría. Esta decisión busca facilitar la identificación de las canecas a personas con diferentes formas de percepción del color.</w:t>
+      </w:r>
+    </w:p>
+    <w:p>
+      <w:pPr>
+        <w:rPr>
+          <w:rFonts w:ascii="Arial" w:hAnsi="Arial" w:cs="Arial"/>
+          <w:b/>
+          <w:bCs/>
+          <w:sz w:val="22"/>
+          <w:szCs w:val="22"/>
+        </w:rPr>
+      </w:pPr>
+      <w:r>
+        <w:rPr>
+          <w:rFonts w:ascii="Arial" w:hAnsi="Arial" w:cs="Arial"/>
+          <w:b/>
+          <w:bCs/>
+          <w:sz w:val="22"/>
+          <w:szCs w:val="22"/>
+        </w:rPr>
+        <w:t>6.</w:t>
+      </w:r>
+      <w:r>
+        <w:rPr>
+          <w:rFonts w:ascii="Arial" w:hAnsi="Arial" w:cs="Arial"/>
+          <w:b/>
+          <w:bCs/>
+          <w:sz w:val="22"/>
+          <w:szCs w:val="22"/>
+        </w:rPr>
+        <w:t>3. Redundancia entre sonidos y señales visuales</w:t>
+      </w:r>
+    </w:p>
+    <w:p>
+      <w:pPr>
+        <w:rPr>
+          <w:rFonts w:ascii="Arial" w:hAnsi="Arial" w:cs="Arial"/>
+          <w:sz w:val="22"/>
+          <w:szCs w:val="22"/>
+        </w:rPr>
+      </w:pPr>
+      <w:r>
+        <w:rPr>
+          <w:rFonts w:ascii="Arial" w:hAnsi="Arial" w:cs="Arial"/>
+          <w:sz w:val="22"/>
+          <w:szCs w:val="22"/>
+        </w:rPr>
+        <w:t>El videojuego incorpora cuatro recursos de audio: sonido de clasificación correcta, sonido de error, música ambiental y sonido de selección mediante clic</w:t>
+      </w:r>
+      <w:r>
+        <w:rPr>
+          <w:rFonts w:ascii="Arial" w:hAnsi="Arial" w:cs="Arial"/>
+          <w:sz w:val="22"/>
+          <w:szCs w:val="22"/>
+        </w:rPr>
+        <w:t>k</w:t>
+      </w:r>
+    </w:p>
+    <w:p>
+      <w:pPr>
+        <w:rPr>
+          <w:rFonts w:ascii="Arial" w:hAnsi="Arial" w:cs="Arial"/>
+          <w:sz w:val="22"/>
+          <w:szCs w:val="22"/>
+        </w:rPr>
+      </w:pPr>
+      <w:r>
+        <w:rPr>
+          <w:rFonts w:ascii="Arial" w:hAnsi="Arial" w:cs="Arial"/>
+          <w:sz w:val="22"/>
+          <w:szCs w:val="22"/>
+        </w:rPr>
+        <w:t xml:space="preserve">La </w:t>
+      </w:r>
+      <w:r>
+        <w:rPr>
+          <w:rFonts w:ascii="Arial" w:hAnsi="Arial" w:cs="Arial"/>
+          <w:sz w:val="22"/>
+          <w:szCs w:val="22"/>
+        </w:rPr>
+        <w:t>clasificación correcta</w:t>
+      </w:r>
+      <w:r>
+        <w:rPr>
+          <w:rFonts w:ascii="Arial" w:hAnsi="Arial" w:cs="Arial"/>
+          <w:sz w:val="22"/>
+          <w:szCs w:val="22"/>
+        </w:rPr>
+        <w:t xml:space="preserve"> y el</w:t>
+      </w:r>
+      <w:r>
+        <w:rPr>
+          <w:rFonts w:ascii="Arial" w:hAnsi="Arial" w:cs="Arial"/>
+          <w:sz w:val="22"/>
+          <w:szCs w:val="22"/>
+        </w:rPr>
+        <w:t xml:space="preserve"> sonido de erro</w:t>
+      </w:r>
+      <w:r>
+        <w:rPr>
+          <w:rFonts w:ascii="Arial" w:hAnsi="Arial" w:cs="Arial"/>
+          <w:sz w:val="22"/>
+          <w:szCs w:val="22"/>
+        </w:rPr>
+        <w:t>r se complementan con señales visuales</w:t>
+      </w:r>
+      <w:r>
+        <w:rPr>
+          <w:rFonts w:ascii="Arial" w:hAnsi="Arial" w:cs="Arial"/>
+          <w:sz w:val="22"/>
+          <w:szCs w:val="22"/>
+        </w:rPr>
+        <w:t>.</w:t>
+      </w:r>
+    </w:p>
+    <w:p>
+      <w:pPr>
+        <w:rPr>
+          <w:rFonts w:ascii="Arial" w:hAnsi="Arial" w:cs="Arial"/>
+          <w:sz w:val="22"/>
+          <w:szCs w:val="22"/>
+        </w:rPr>
+      </w:pPr>
+      <w:r>
+        <w:rPr>
+          <w:rFonts w:ascii="Arial" w:hAnsi="Arial" w:cs="Arial"/>
+          <w:sz w:val="22"/>
+          <w:szCs w:val="22"/>
+        </w:rPr>
+        <w:t>La música ambiental contribuye a la atmósfera del juego, mientras que los efectos de selección, acierto y error informan sobre las acciones realizadas. Se recomienda permitir el control del volumen.</w:t>
+      </w:r>
+    </w:p>
+    <w:p>
+      <w:pPr>
+        <w:rPr>
+          <w:rFonts w:ascii="Arial" w:hAnsi="Arial" w:cs="Arial"/>
+          <w:sz w:val="22"/>
+          <w:szCs w:val="22"/>
+        </w:rPr>
+      </w:pPr>
+      <w:r>
+        <w:rPr>
+          <w:rFonts w:ascii="Arial" w:hAnsi="Arial" w:cs="Arial"/>
+          <w:b/>
+          <w:bCs/>
+          <w:sz w:val="22"/>
+          <w:szCs w:val="22"/>
+        </w:rPr>
+        <w:t>Evidencias:</w:t>
+      </w:r>
+      <w:r>
+        <w:rPr>
+          <w:rFonts w:ascii="Arial" w:hAnsi="Arial" w:cs="Arial"/>
+          <w:sz w:val="22"/>
+          <w:szCs w:val="22"/>
+        </w:rPr>
+        <w:t xml:space="preserve"> grabación</w:t>
+      </w:r>
+      <w:r>
+        <w:rPr>
+          <w:rFonts w:ascii="Arial" w:hAnsi="Arial" w:cs="Arial"/>
+          <w:sz w:val="22"/>
+          <w:szCs w:val="22"/>
+        </w:rPr>
+        <w:t>.</w:t>
       </w:r>
     </w:p>
     <w:p>
@@ -6482,6 +6737,155 @@
     </w:lvl>
   </w:abstractNum>
   <w:abstractNum w:abstractNumId="9" w15:restartNumberingAfterBreak="0">
+    <w:nsid w:val="60A0357D"/>
+    <w:multiLevelType w:val="multilevel"/>
+    <w:tmpl w:val="6180E990"/>
+    <w:lvl w:ilvl="0">
+      <w:start w:val="1"/>
+      <w:numFmt w:val="bullet"/>
+      <w:lvlText w:val=""/>
+      <w:lvlJc w:val="left"/>
+      <w:pPr>
+        <w:tabs>
+          <w:tab w:val="num" w:pos="720"/>
+        </w:tabs>
+        <w:ind w:left="720" w:hanging="360"/>
+      </w:pPr>
+      <w:rPr>
+        <w:rFonts w:ascii="Symbol" w:hAnsi="Symbol" w:hint="default"/>
+        <w:sz w:val="20"/>
+      </w:rPr>
+    </w:lvl>
+    <w:lvl w:ilvl="1" w:tentative="1">
+      <w:start w:val="1"/>
+      <w:numFmt w:val="bullet"/>
+      <w:lvlText w:val="o"/>
+      <w:lvlJc w:val="left"/>
+      <w:pPr>
+        <w:tabs>
+          <w:tab w:val="num" w:pos="1440"/>
+        </w:tabs>
+        <w:ind w:left="1440" w:hanging="360"/>
+      </w:pPr>
+      <w:rPr>
+        <w:rFonts w:ascii="Courier New" w:hAnsi="Courier New" w:hint="default"/>
+        <w:sz w:val="20"/>
+      </w:rPr>
+    </w:lvl>
+    <w:lvl w:ilvl="2" w:tentative="1">
+      <w:start w:val="1"/>
+      <w:numFmt w:val="bullet"/>
+      <w:lvlText w:val=""/>
+      <w:lvlJc w:val="left"/>
+      <w:pPr>
+        <w:tabs>
+          <w:tab w:val="num" w:pos="2160"/>
+        </w:tabs>
+        <w:ind w:left="2160" w:hanging="360"/>
+      </w:pPr>
+      <w:rPr>
+        <w:rFonts w:ascii="Wingdings" w:hAnsi="Wingdings" w:hint="default"/>
+        <w:sz w:val="20"/>
+      </w:rPr>
+    </w:lvl>
+    <w:lvl w:ilvl="3" w:tentative="1">
+      <w:start w:val="1"/>
+      <w:numFmt w:val="bullet"/>
+      <w:lvlText w:val=""/>
+      <w:lvlJc w:val="left"/>
+      <w:pPr>
+        <w:tabs>
+          <w:tab w:val="num" w:pos="2880"/>
+        </w:tabs>
+        <w:ind w:left="2880" w:hanging="360"/>
+      </w:pPr>
+      <w:rPr>
+        <w:rFonts w:ascii="Wingdings" w:hAnsi="Wingdings" w:hint="default"/>
+        <w:sz w:val="20"/>
+      </w:rPr>
+    </w:lvl>
+    <w:lvl w:ilvl="4" w:tentative="1">
+      <w:start w:val="1"/>
+      <w:numFmt w:val="bullet"/>
+      <w:lvlText w:val=""/>
+      <w:lvlJc w:val="left"/>
+      <w:pPr>
+        <w:tabs>
+          <w:tab w:val="num" w:pos="3600"/>
+        </w:tabs>
+        <w:ind w:left="3600" w:hanging="360"/>
+      </w:pPr>
+      <w:rPr>
+        <w:rFonts w:ascii="Wingdings" w:hAnsi="Wingdings" w:hint="default"/>
+        <w:sz w:val="20"/>
+      </w:rPr>
+    </w:lvl>
+    <w:lvl w:ilvl="5" w:tentative="1">
+      <w:start w:val="1"/>
+      <w:numFmt w:val="bullet"/>
+      <w:lvlText w:val=""/>
+      <w:lvlJc w:val="left"/>
+      <w:pPr>
+        <w:tabs>
+          <w:tab w:val="num" w:pos="4320"/>
+        </w:tabs>
+        <w:ind w:left="4320" w:hanging="360"/>
+      </w:pPr>
+      <w:rPr>
+        <w:rFonts w:ascii="Wingdings" w:hAnsi="Wingdings" w:hint="default"/>
+        <w:sz w:val="20"/>
+      </w:rPr>
+    </w:lvl>
+    <w:lvl w:ilvl="6" w:tentative="1">
+      <w:start w:val="1"/>
+      <w:numFmt w:val="bullet"/>
+      <w:lvlText w:val=""/>
+      <w:lvlJc w:val="left"/>
+      <w:pPr>
+        <w:tabs>
+          <w:tab w:val="num" w:pos="5040"/>
+        </w:tabs>
+        <w:ind w:left="5040" w:hanging="360"/>
+      </w:pPr>
+      <w:rPr>
+        <w:rFonts w:ascii="Wingdings" w:hAnsi="Wingdings" w:hint="default"/>
+        <w:sz w:val="20"/>
+      </w:rPr>
+    </w:lvl>
+    <w:lvl w:ilvl="7" w:tentative="1">
+      <w:start w:val="1"/>
+      <w:numFmt w:val="bullet"/>
+      <w:lvlText w:val=""/>
+      <w:lvlJc w:val="left"/>
+      <w:pPr>
+        <w:tabs>
+          <w:tab w:val="num" w:pos="5760"/>
+        </w:tabs>
+        <w:ind w:left="5760" w:hanging="360"/>
+      </w:pPr>
+      <w:rPr>
+        <w:rFonts w:ascii="Wingdings" w:hAnsi="Wingdings" w:hint="default"/>
+        <w:sz w:val="20"/>
+      </w:rPr>
+    </w:lvl>
+    <w:lvl w:ilvl="8" w:tentative="1">
+      <w:start w:val="1"/>
+      <w:numFmt w:val="bullet"/>
+      <w:lvlText w:val=""/>
+      <w:lvlJc w:val="left"/>
+      <w:pPr>
+        <w:tabs>
+          <w:tab w:val="num" w:pos="6480"/>
+        </w:tabs>
+        <w:ind w:left="6480" w:hanging="360"/>
+      </w:pPr>
+      <w:rPr>
+        <w:rFonts w:ascii="Wingdings" w:hAnsi="Wingdings" w:hint="default"/>
+        <w:sz w:val="20"/>
+      </w:rPr>
+    </w:lvl>
+  </w:abstractNum>
+  <w:abstractNum w:abstractNumId="10" w15:restartNumberingAfterBreak="0">
     <w:nsid w:val="60C5407A"/>
     <w:multiLevelType w:val="multilevel"/>
     <w:tmpl w:val="86E0C9C2"/>
@@ -6630,7 +7034,7 @@
       </w:rPr>
     </w:lvl>
   </w:abstractNum>
-  <w:abstractNum w:abstractNumId="10" w15:restartNumberingAfterBreak="0">
+  <w:abstractNum w:abstractNumId="11" w15:restartNumberingAfterBreak="0">
     <w:nsid w:val="71300975"/>
     <w:multiLevelType w:val="multilevel"/>
     <w:tmpl w:val="EF16CF24"/>
@@ -6783,7 +7187,7 @@
     <w:abstractNumId w:val="4"/>
   </w:num>
   <w:num w:numId="2" w16cid:durableId="1388451846">
-    <w:abstractNumId w:val="9"/>
+    <w:abstractNumId w:val="10"/>
   </w:num>
   <w:num w:numId="3" w16cid:durableId="90711173">
     <w:abstractNumId w:val="2"/>
@@ -6798,7 +7202,7 @@
     <w:abstractNumId w:val="7"/>
   </w:num>
   <w:num w:numId="7" w16cid:durableId="369304640">
-    <w:abstractNumId w:val="10"/>
+    <w:abstractNumId w:val="11"/>
   </w:num>
   <w:num w:numId="8" w16cid:durableId="1336613173">
     <w:abstractNumId w:val="6"/>
@@ -6811,6 +7215,9 @@
   </w:num>
   <w:num w:numId="11" w16cid:durableId="156000756">
     <w:abstractNumId w:val="3"/>
+  </w:num>
+  <w:num w:numId="12" w16cid:durableId="2077046903">
+    <w:abstractNumId w:val="9"/>
   </w:num>
 </w:numbering>
 </file>
@@ -7748,6 +8155,29 @@
       <w:spacing w:val="5"/>
     </w:rPr>
   </w:style>
+  <w:style w:type="character" w:styleId="Hipervnculo">
+    <w:name w:val="Hyperlink"/>
+    <w:basedOn w:val="Fuentedeprrafopredeter"/>
+    <w:uiPriority w:val="99"/>
+    <w:unhideWhenUsed/>
+    <w:rsid w:val="001243E1"/>
+    <w:rPr>
+      <w:color w:val="0563C1" w:themeColor="hyperlink"/>
+      <w:u w:val="single"/>
+    </w:rPr>
+  </w:style>
+  <w:style w:type="character" w:styleId="Mencinsinresolver">
+    <w:name w:val="Unresolved Mention"/>
+    <w:basedOn w:val="Fuentedeprrafopredeter"/>
+    <w:uiPriority w:val="99"/>
+    <w:semiHidden/>
+    <w:unhideWhenUsed/>
+    <w:rsid w:val="001243E1"/>
+    <w:rPr>
+      <w:color w:val="605E5C"/>
+      <w:shd w:val="clear" w:color="auto" w:fill="E1DFDD"/>
+    </w:rPr>
+  </w:style>
 </w:styles>
 </file>
 

</xml_diff>